<commit_message>
Batch 3 2026-07-31: 5 new pipeline leads built to full SOP — gate PASS 41 active
surens-car-upholstery, sunshine-flowers, dzl-services-and-repairs, ethekweni-locksmiths, sumeshnee-pillay-physiotherapist (real Fresha booking CTA). Each re-gated manually (2 candidates dropped as HAS_SITE: Pilates & Yoga on the Avenue, Kwakhanya — free Wix subdomain; now a gate rule). Vetted photos, premium index + unique journal, Comms Bridge, two-option quote + 3-doc pack, Word + client-facing quotation. Render sweep 10 pages/22 images 0 failures. Board + lead book (36) updated; slugs minted.

Co-Authored-By: Claude Fable 5 <noreply@anthropic.com>
</commit_message>
<xml_diff>
--- a/areeb-guru-barber-shop/docs/quotation-client.docx
+++ b/areeb-guru-barber-shop/docs/quotation-client.docx
@@ -155,7 +155,7 @@
                 <w:sz w:val="18"/>
                 <w:szCs w:val="18"/>
               </w:rPr>
-              <w:t xml:space="preserve">Quote no. AQ-20260817-AGBS</w:t>
+              <w:t xml:space="preserve">Quote no. AQ-20260819-AGBS</w:t>
             </w:r>
           </w:p>
           <w:p>
@@ -170,7 +170,7 @@
                 <w:sz w:val="18"/>
                 <w:szCs w:val="18"/>
               </w:rPr>
-              <w:t xml:space="preserve">Date 2026-08-17</w:t>
+              <w:t xml:space="preserve">Date 2026-08-19</w:t>
             </w:r>
           </w:p>
           <w:p>
@@ -185,7 +185,7 @@
                 <w:sz w:val="18"/>
                 <w:szCs w:val="18"/>
               </w:rPr>
-              <w:t xml:space="preserve">Valid until 2026-09-16</w:t>
+              <w:t xml:space="preserve">Valid until 2026-09-18</w:t>
             </w:r>
           </w:p>
           <w:p>

</xml_diff>

<commit_message>
Batch 4 2026-08-23: 5 new pipeline leads built to full SOP - gate PASS 46 active
queensburgh-car-wash, gillitts-marquee-and-chair-hire, zalo-preschool-and-aftercare (child-safety photo policy applied), the-laundry-lounge-hillary, benze-tailors-hillcrest. Strict-gated scout (160 queries/871 places; 9 HAS_SITE rejects incl. 2 rebuild pitches: Citi Line Panel Beaters, Tanielle's Sewing Room). Vetted photos (Infinity Car Wash and US-laundromat contamination caught), two-option quotes, 4-doc packs, Word + client quotations. Render sweep 0 failures; totals audited. Board + lead book (41); slugs minted.

Co-Authored-By: Claude Fable 5 <noreply@anthropic.com>
</commit_message>
<xml_diff>
--- a/areeb-guru-barber-shop/docs/quotation-client.docx
+++ b/areeb-guru-barber-shop/docs/quotation-client.docx
@@ -155,7 +155,7 @@
                 <w:sz w:val="18"/>
                 <w:szCs w:val="18"/>
               </w:rPr>
-              <w:t xml:space="preserve">Quote no. AQ-20260819-AGBS</w:t>
+              <w:t xml:space="preserve">Quote no. AQ-20260824-AGBS</w:t>
             </w:r>
           </w:p>
           <w:p>
@@ -170,7 +170,7 @@
                 <w:sz w:val="18"/>
                 <w:szCs w:val="18"/>
               </w:rPr>
-              <w:t xml:space="preserve">Date 2026-08-19</w:t>
+              <w:t xml:space="preserve">Date 2026-08-24</w:t>
             </w:r>
           </w:p>
           <w:p>
@@ -185,7 +185,7 @@
                 <w:sz w:val="18"/>
                 <w:szCs w:val="18"/>
               </w:rPr>
-              <w:t xml:space="preserve">Valid until 2026-09-18</w:t>
+              <w:t xml:space="preserve">Valid until 2026-09-23</w:t>
             </w:r>
           </w:p>
           <w:p>

</xml_diff>